<commit_message>
Add FIRST Robotics electrical lead and stadium experience
</commit_message>
<xml_diff>
--- a/dist/downloads/Vincent-Cook-Manufacturing-Production.docx
+++ b/dist/downloads/Vincent-Cook-Manufacturing-Production.docx
@@ -82,14 +82,14 @@
           <w:color w:val="202A31"/>
           <w:sz w:val="20"/>
         </w:rPr>
-        <w:t>Aerospace engineering senior with CAD assembly design and electric motor test-bench documentation experience. Apply structural and materials coursework, wind-tunnel testing, wing-model design, and project planning to manufacturing and production engineering.</w:t>
+        <w:t>Aerospace engineering senior with CAD assembly design, motor test-bench documentation, circuitry design, and battery testing experience. Apply structures, materials, wind-tunnel testing, and project planning to production engineering.</w:t>
       </w:r>
     </w:p>
     <w:p>
       <w:pPr>
         <w:keepNext/>
         <w:keepLines/>
-        <w:spacing w:before="140" w:after="60" w:line="240" w:lineRule="exact"/>
+        <w:spacing w:before="100" w:after="60" w:line="240" w:lineRule="exact"/>
       </w:pPr>
       <w:r>
         <w:rPr>
@@ -137,7 +137,7 @@
       <w:pPr>
         <w:keepNext/>
         <w:keepLines/>
-        <w:spacing w:before="140" w:after="60" w:line="240" w:lineRule="exact"/>
+        <w:spacing w:before="100" w:after="60" w:line="240" w:lineRule="exact"/>
       </w:pPr>
       <w:r>
         <w:rPr>
@@ -185,7 +185,7 @@
       <w:pPr>
         <w:keepNext/>
         <w:keepLines/>
-        <w:spacing w:before="140" w:after="60" w:line="240" w:lineRule="exact"/>
+        <w:spacing w:before="100" w:after="60" w:line="240" w:lineRule="exact"/>
       </w:pPr>
       <w:r>
         <w:rPr>
@@ -201,7 +201,7 @@
       <w:pPr>
         <w:keepNext/>
         <w:keepLines/>
-        <w:spacing w:before="80" w:after="0" w:line="234" w:lineRule="exact"/>
+        <w:spacing w:before="60" w:after="0" w:line="234" w:lineRule="exact"/>
       </w:pPr>
       <w:r>
         <w:rPr>
@@ -243,31 +243,14 @@
           <w:color w:val="202A31"/>
           <w:sz w:val="20"/>
         </w:rPr>
-        <w:t>•  Developed 3D CAD models and assembly instructions for an electric motor performance test bench, defining how mechanical and electrical components fit together.</w:t>
-      </w:r>
-    </w:p>
-    <w:p>
-      <w:pPr>
-        <w:keepNext w:val="0"/>
-        <w:keepLines/>
-        <w:spacing w:before="0" w:after="20" w:line="234" w:lineRule="exact"/>
-        <w:ind w:left="160" w:hanging="160"/>
-      </w:pPr>
-      <w:r>
-        <w:rPr>
-          <w:rFonts w:ascii="Arial" w:hAnsi="Arial"/>
-          <w:b w:val="0"/>
-          <w:color w:val="202A31"/>
-          <w:sz w:val="20"/>
-        </w:rPr>
-        <w:t>•  Collaborated with teammates to align engineering and manufacturing practices and troubleshoot technical challenges.</w:t>
+        <w:t>•  Developed 3D CAD and assembly instructions for an electric motor test bench; integrated mechanical/electrical components and aligned engineering/manufacturing practices with teammates.</w:t>
       </w:r>
     </w:p>
     <w:p>
       <w:pPr>
         <w:keepNext/>
         <w:keepLines/>
-        <w:spacing w:before="80" w:after="0" w:line="234" w:lineRule="exact"/>
+        <w:spacing w:before="60" w:after="0" w:line="234" w:lineRule="exact"/>
       </w:pPr>
       <w:r>
         <w:rPr>
@@ -309,7 +292,7 @@
           <w:color w:val="202A31"/>
           <w:sz w:val="20"/>
         </w:rPr>
-        <w:t>•  Contribute to wing-model design and project planning for a hybrid battery-electric and hydrogen fuel-cell model aircraft.</w:t>
+        <w:t>•  Contribute wing-model designs and planning for a hybrid battery-electric/hydrogen fuel-cell model aircraft.</w:t>
       </w:r>
     </w:p>
     <w:p>
@@ -326,31 +309,14 @@
           <w:color w:val="202A31"/>
           <w:sz w:val="20"/>
         </w:rPr>
-        <w:t>•  Planned work includes CAD, CFD and thermodynamic analysis, aircraft construction/testing, and battery/fuel-system electronics integration.</w:t>
-      </w:r>
-    </w:p>
-    <w:p>
-      <w:pPr>
-        <w:keepNext w:val="0"/>
-        <w:keepLines/>
-        <w:spacing w:before="0" w:after="20" w:line="234" w:lineRule="exact"/>
-        <w:ind w:left="160" w:hanging="160"/>
-      </w:pPr>
-      <w:r>
-        <w:rPr>
-          <w:rFonts w:ascii="Arial" w:hAnsi="Arial"/>
-          <w:b w:val="0"/>
-          <w:color w:val="202A31"/>
-          <w:sz w:val="20"/>
-        </w:rPr>
-        <w:t>•  Planned scope also includes commercial-scale modeling; the team targets first flight in spring 2027.</w:t>
+        <w:t>•  Planned: CAD, CFD/thermodynamics, construction/testing, battery/fuel-system electronics, and commercial-scale modeling; team flight target spring 2027.</w:t>
       </w:r>
     </w:p>
     <w:p>
       <w:pPr>
         <w:keepNext/>
         <w:keepLines/>
-        <w:spacing w:before="80" w:after="0" w:line="234" w:lineRule="exact"/>
+        <w:spacing w:before="60" w:after="0" w:line="234" w:lineRule="exact"/>
       </w:pPr>
       <w:r>
         <w:rPr>
@@ -392,31 +358,14 @@
           <w:color w:val="202A31"/>
           <w:sz w:val="20"/>
         </w:rPr>
-        <w:t>•  Designed a transmitter mast integrating camera and sensor mounting features for a student robot.</w:t>
-      </w:r>
-    </w:p>
-    <w:p>
-      <w:pPr>
-        <w:keepNext w:val="0"/>
-        <w:keepLines/>
-        <w:spacing w:before="0" w:after="20" w:line="234" w:lineRule="exact"/>
-        <w:ind w:left="160" w:hanging="160"/>
-      </w:pPr>
-      <w:r>
-        <w:rPr>
-          <w:rFonts w:ascii="Arial" w:hAnsi="Arial"/>
-          <w:b w:val="0"/>
-          <w:color w:val="202A31"/>
-          <w:sz w:val="20"/>
-        </w:rPr>
-        <w:t>•  Used stress analysis to refine robot structure, reinforce high-stress regions, and select lighter materials for lower-load sections.</w:t>
+        <w:t>•  Designed a transmitter mast with camera and sensor mounts; used stress analysis to reinforce high-load regions and select lighter materials for lower-load sections.</w:t>
       </w:r>
     </w:p>
     <w:p>
       <w:pPr>
         <w:keepNext/>
         <w:keepLines/>
-        <w:spacing w:before="80" w:after="0" w:line="234" w:lineRule="exact"/>
+        <w:spacing w:before="60" w:after="0" w:line="234" w:lineRule="exact"/>
       </w:pPr>
       <w:r>
         <w:rPr>
@@ -458,31 +407,14 @@
           <w:color w:val="202A31"/>
           <w:sz w:val="20"/>
         </w:rPr>
-        <w:t>•  Created landing-leg CAD models for a reusable rocket concept and developed code producing trajectory-angle-versus-time plots.</w:t>
-      </w:r>
-    </w:p>
-    <w:p>
-      <w:pPr>
-        <w:keepNext w:val="0"/>
-        <w:keepLines/>
-        <w:spacing w:before="0" w:after="20" w:line="234" w:lineRule="exact"/>
-        <w:ind w:left="160" w:hanging="160"/>
-      </w:pPr>
-      <w:r>
-        <w:rPr>
-          <w:rFonts w:ascii="Arial" w:hAnsi="Arial"/>
-          <w:b w:val="0"/>
-          <w:color w:val="202A31"/>
-          <w:sz w:val="20"/>
-        </w:rPr>
-        <w:t>•  Delegated design and programming tasks, coordinated subteam work, and provided constructive technical feedback.</w:t>
+        <w:t>•  Created landing-leg CAD and code producing trajectory-angle-versus-time plots for a reusable rocket concept; delegated CAD/programming tasks, coordinated subteam work, and provided technical feedback.</w:t>
       </w:r>
     </w:p>
     <w:p>
       <w:pPr>
         <w:keepNext/>
         <w:keepLines/>
-        <w:spacing w:before="80" w:after="0" w:line="234" w:lineRule="exact"/>
+        <w:spacing w:before="60" w:after="0" w:line="234" w:lineRule="exact"/>
       </w:pPr>
       <w:r>
         <w:rPr>
@@ -524,14 +456,63 @@
           <w:color w:val="202A31"/>
           <w:sz w:val="20"/>
         </w:rPr>
-        <w:t>•  Help plan scientific approaches and evaluate mechanical-component options for a robotic lunar surface payload mission concept.</w:t>
+        <w:t>•  Help plan science approaches and evaluate mechanical components for a robotic lunar surface payload mission concept.</w:t>
       </w:r>
     </w:p>
     <w:p>
       <w:pPr>
         <w:keepNext/>
         <w:keepLines/>
-        <w:spacing w:before="140" w:after="60" w:line="240" w:lineRule="exact"/>
+        <w:spacing w:before="60" w:after="0" w:line="234" w:lineRule="exact"/>
+      </w:pPr>
+      <w:r>
+        <w:rPr>
+          <w:rFonts w:ascii="Arial" w:hAnsi="Arial"/>
+          <w:b/>
+          <w:color w:val="202A31"/>
+          <w:sz w:val="20"/>
+        </w:rPr>
+        <w:t>FIRST Robotics Team 3925</w:t>
+      </w:r>
+    </w:p>
+    <w:p>
+      <w:pPr>
+        <w:keepNext/>
+        <w:keepLines/>
+        <w:spacing w:before="0" w:after="0" w:line="234" w:lineRule="exact"/>
+      </w:pPr>
+      <w:r>
+        <w:rPr>
+          <w:rFonts w:ascii="Arial" w:hAnsi="Arial"/>
+          <w:b w:val="0"/>
+          <w:color w:val="202A31"/>
+          <w:sz w:val="20"/>
+        </w:rPr>
+        <w:t>Electrical Lead — High School Robotics | 2020–2022</w:t>
+      </w:r>
+    </w:p>
+    <w:p>
+      <w:pPr>
+        <w:keepNext w:val="0"/>
+        <w:keepLines/>
+        <w:spacing w:before="0" w:after="20" w:line="234" w:lineRule="exact"/>
+        <w:ind w:left="160" w:hanging="160"/>
+      </w:pPr>
+      <w:r>
+        <w:rPr>
+          <w:rFonts w:ascii="Arial" w:hAnsi="Arial"/>
+          <w:b w:val="0"/>
+          <w:color w:val="202A31"/>
+          <w:sz w:val="20"/>
+        </w:rPr>
+        <w:t>•  Designed circuitry and tested batteries for the team's robot.</w:t>
+      </w:r>
+    </w:p>
+    <w:p>
+      <w:pPr>
+        <w:keepNext/>
+        <w:keepLines/>
+        <w:spacing w:before="100" w:after="60" w:line="240" w:lineRule="exact"/>
       </w:pPr>
       <w:r>
         <w:rPr>
@@ -557,7 +538,7 @@
           <w:color w:val="202A31"/>
           <w:sz w:val="20"/>
         </w:rPr>
-        <w:t>•  AE 20 | Motor CAD: Created high-level motor designs in introductory CAD coursework.</w:t>
+        <w:t>•  AE 20 | Created high-level motor designs in introductory CAD coursework.</w:t>
       </w:r>
     </w:p>
     <w:p>
@@ -574,7 +555,7 @@
           <w:color w:val="202A31"/>
           <w:sz w:val="20"/>
         </w:rPr>
-        <w:t>•  AE 112 / AE 114 | Structures &amp; materials: Studied structural dynamics and physical/material properties.</w:t>
+        <w:t>•  AE 112 / AE 114 | Studied structural dynamics and physical/material properties.</w:t>
       </w:r>
     </w:p>
     <w:p>
@@ -591,14 +572,14 @@
           <w:color w:val="202A31"/>
           <w:sz w:val="20"/>
         </w:rPr>
-        <w:t>•  AE 160 / AE 162 | Wind-tunnel labs: Used open wind-tunnel lab simulations to test wing airfoils and other objects.</w:t>
+        <w:t>•  AE 160 / AE 162 | Used open wind-tunnel lab simulations to test wing airfoils and other objects.</w:t>
       </w:r>
     </w:p>
     <w:p>
       <w:pPr>
         <w:keepNext/>
         <w:keepLines/>
-        <w:spacing w:before="140" w:after="60" w:line="240" w:lineRule="exact"/>
+        <w:spacing w:before="100" w:after="60" w:line="240" w:lineRule="exact"/>
       </w:pPr>
       <w:r>
         <w:rPr>
@@ -614,7 +595,40 @@
       <w:pPr>
         <w:keepNext/>
         <w:keepLines/>
-        <w:spacing w:before="60" w:after="0" w:line="234" w:lineRule="exact"/>
+        <w:spacing w:before="40" w:after="0" w:line="234" w:lineRule="exact"/>
+      </w:pPr>
+      <w:r>
+        <w:rPr>
+          <w:rFonts w:ascii="Arial" w:hAnsi="Arial"/>
+          <w:b/>
+          <w:color w:val="202A31"/>
+          <w:sz w:val="20"/>
+        </w:rPr>
+        <w:t>PayPal Stadium | Guest Representative | 2026 Soccer Season</w:t>
+      </w:r>
+    </w:p>
+    <w:p>
+      <w:pPr>
+        <w:keepNext w:val="0"/>
+        <w:keepLines/>
+        <w:spacing w:before="0" w:after="20" w:line="234" w:lineRule="exact"/>
+        <w:ind w:left="160" w:hanging="160"/>
+      </w:pPr>
+      <w:r>
+        <w:rPr>
+          <w:rFonts w:ascii="Arial" w:hAnsi="Arial"/>
+          <w:b w:val="0"/>
+          <w:color w:val="202A31"/>
+          <w:sz w:val="20"/>
+        </w:rPr>
+        <w:t>•  Worked San Jose Earthquakes and Bay FC women's team matches.</w:t>
+      </w:r>
+    </w:p>
+    <w:p>
+      <w:pPr>
+        <w:keepNext/>
+        <w:keepLines/>
+        <w:spacing w:before="40" w:after="0" w:line="234" w:lineRule="exact"/>
       </w:pPr>
       <w:r>
         <w:rPr>
@@ -640,14 +654,14 @@
           <w:color w:val="202A31"/>
           <w:sz w:val="20"/>
         </w:rPr>
-        <w:t>•  Led hands-on STEM labs and design challenges, communicating procedures and technical concepts clearly.</w:t>
+        <w:t>•  Led STEM labs/design challenges and explained procedures and technical concepts.</w:t>
       </w:r>
     </w:p>
     <w:p>
       <w:pPr>
         <w:keepNext/>
         <w:keepLines/>
-        <w:spacing w:before="60" w:after="0" w:line="234" w:lineRule="exact"/>
+        <w:spacing w:before="40" w:after="0" w:line="234" w:lineRule="exact"/>
       </w:pPr>
       <w:r>
         <w:rPr>
@@ -673,14 +687,14 @@
           <w:color w:val="202A31"/>
           <w:sz w:val="20"/>
         </w:rPr>
-        <w:t>•  Coordinated multiple clients, scheduled lessons, and tailored instruction to individual needs.</w:t>
+        <w:t>•  Scheduled clients and tailored swim lessons to individual needs.</w:t>
       </w:r>
     </w:p>
     <w:p>
       <w:pPr>
         <w:keepNext/>
         <w:keepLines/>
-        <w:spacing w:before="60" w:after="0" w:line="234" w:lineRule="exact"/>
+        <w:spacing w:before="40" w:after="0" w:line="234" w:lineRule="exact"/>
       </w:pPr>
       <w:r>
         <w:rPr>
@@ -706,7 +720,7 @@
           <w:color w:val="202A31"/>
           <w:sz w:val="20"/>
         </w:rPr>
-        <w:t>•  Balanced coaching and lifeguard responsibilities while adapting lessons for swimmers with varied abilities.</w:t>
+        <w:t>•  Balanced coaching/lifeguard work and adapted swim lessons to varied abilities.</w:t>
       </w:r>
     </w:p>
     <w:sectPr>

</xml_diff>

<commit_message>
Expand coursework projects and add HVAC internship resume
</commit_message>
<xml_diff>
--- a/dist/downloads/Vincent-Cook-Manufacturing-Production.docx
+++ b/dist/downloads/Vincent-Cook-Manufacturing-Production.docx
@@ -66,7 +66,7 @@
           <w:color w:val="202A31"/>
           <w:sz w:val="20"/>
         </w:rPr>
-        <w:t>linkedin.com/in/vincent-cook-080790227</w:t>
+        <w:t>linkedin.com/in/vincent-cook-080790227 | vincook-code.github.io/Engineering-Work/</w:t>
       </w:r>
     </w:p>
     <w:p>
@@ -82,7 +82,7 @@
           <w:color w:val="202A31"/>
           <w:sz w:val="20"/>
         </w:rPr>
-        <w:t>Aerospace engineering senior with CAD assembly design, motor test-bench documentation, circuitry design, and battery testing experience. Apply structures, materials, wind-tunnel testing, and project planning to production engineering.</w:t>
+        <w:t>Aerospace engineering senior with CAD assemblies, schematics, motor test-bench documentation, and electrical troubleshooting experience. Background includes structural lab testing, wind-tunnel measurements, and mechanical project planning.</w:t>
       </w:r>
     </w:p>
     <w:p>
@@ -162,7 +162,7 @@
           <w:color w:val="202A31"/>
           <w:sz w:val="20"/>
         </w:rPr>
-        <w:t>Design &amp; documentation: SolidWorks, Autodesk Inventor, 3D CAD, assembly instructions, stress analysis</w:t>
+        <w:t>Design: SolidWorks, Autodesk Inventor, 3D CAD, schematics, assembly instructions, stress analysis</w:t>
       </w:r>
     </w:p>
     <w:p>
@@ -178,7 +178,7 @@
           <w:color w:val="202A31"/>
           <w:sz w:val="20"/>
         </w:rPr>
-        <w:t>Analysis &amp; tools: simulation and modeling, CFD, thermal testing, MATLAB, Python, C++, Java</w:t>
+        <w:t>Testing: circuit repairs, battery testing, MATLAB/Simulink, Python, CFD, thermal testing, simulation</w:t>
       </w:r>
     </w:p>
     <w:p>
@@ -212,21 +212,13 @@
         </w:rPr>
         <w:t>SAE Spartan Racing</w:t>
       </w:r>
-    </w:p>
-    <w:p>
-      <w:pPr>
-        <w:keepNext/>
-        <w:keepLines/>
-        <w:spacing w:before="0" w:after="0" w:line="234" w:lineRule="exact"/>
-      </w:pPr>
       <w:r>
         <w:rPr>
           <w:rFonts w:ascii="Arial" w:hAnsi="Arial"/>
-          <w:b w:val="0"/>
           <w:color w:val="202A31"/>
           <w:sz w:val="20"/>
         </w:rPr>
-        <w:t>EV Powertrain Intern | Aug 2023–May 2025</w:t>
+        <w:t xml:space="preserve"> | EV Powertrain Intern | Aug 2023-May 2025</w:t>
       </w:r>
     </w:p>
     <w:p>
@@ -243,7 +235,7 @@
           <w:color w:val="202A31"/>
           <w:sz w:val="20"/>
         </w:rPr>
-        <w:t>•  Developed 3D CAD and assembly instructions for an electric motor test bench; integrated mechanical/electrical components and aligned engineering/manufacturing practices with teammates.</w:t>
+        <w:t>-  Developed CAD and assembly instructions for an electric motor test bench; integrated mechanical/electrical components and aligned engineering/manufacturing practices.</w:t>
       </w:r>
     </w:p>
     <w:p>
@@ -259,7 +251,7 @@
           <w:color w:val="202A31"/>
           <w:sz w:val="20"/>
         </w:rPr>
-        <w:t>Hybrid Electric / Hydrogen Fuel-Cell Aircraft | SJSU Senior Project</w:t>
+        <w:t>Hybrid Electric / Hydrogen Fuel-Cell Aircraft | SJSU Capstone</w:t>
       </w:r>
     </w:p>
     <w:p>
@@ -275,7 +267,7 @@
           <w:color w:val="202A31"/>
           <w:sz w:val="20"/>
         </w:rPr>
-        <w:t>Aerospace Engineering Team Member — In Progress | 2026–Present</w:t>
+        <w:t>Aerospace Engineering Team Member - In Progress | 2026-Present</w:t>
       </w:r>
     </w:p>
     <w:p>
@@ -292,24 +284,7 @@
           <w:color w:val="202A31"/>
           <w:sz w:val="20"/>
         </w:rPr>
-        <w:t>•  Contribute wing-model designs and planning for a hybrid battery-electric/hydrogen fuel-cell model aircraft.</w:t>
-      </w:r>
-    </w:p>
-    <w:p>
-      <w:pPr>
-        <w:keepNext w:val="0"/>
-        <w:keepLines/>
-        <w:spacing w:before="0" w:after="20" w:line="234" w:lineRule="exact"/>
-        <w:ind w:left="160" w:hanging="160"/>
-      </w:pPr>
-      <w:r>
-        <w:rPr>
-          <w:rFonts w:ascii="Arial" w:hAnsi="Arial"/>
-          <w:b w:val="0"/>
-          <w:color w:val="202A31"/>
-          <w:sz w:val="20"/>
-        </w:rPr>
-        <w:t>•  Planned: CAD, CFD/thermodynamics, construction/testing, battery/fuel-system electronics, and commercial-scale modeling; team flight target spring 2027.</w:t>
+        <w:t>-  Contribute wing-model designs and project planning. Planned work includes CAD, CFD/thermal analysis, fabrication/testing, and fuel/battery electronics; team flight target spring 2027.</w:t>
       </w:r>
     </w:p>
     <w:p>
@@ -327,21 +302,13 @@
         </w:rPr>
         <w:t>SJSU Robotics</w:t>
       </w:r>
-    </w:p>
-    <w:p>
-      <w:pPr>
-        <w:keepNext/>
-        <w:keepLines/>
-        <w:spacing w:before="0" w:after="0" w:line="234" w:lineRule="exact"/>
-      </w:pPr>
       <w:r>
         <w:rPr>
           <w:rFonts w:ascii="Arial" w:hAnsi="Arial"/>
-          <w:b w:val="0"/>
           <w:color w:val="202A31"/>
           <w:sz w:val="20"/>
         </w:rPr>
-        <w:t>Mechanical Designer | Aug 2024–Present</w:t>
+        <w:t xml:space="preserve"> | Mechanical Designer | Aug 2024-Present</w:t>
       </w:r>
     </w:p>
     <w:p>
@@ -358,7 +325,7 @@
           <w:color w:val="202A31"/>
           <w:sz w:val="20"/>
         </w:rPr>
-        <w:t>•  Designed a transmitter mast with camera and sensor mounts; used stress analysis to reinforce high-load regions and select lighter materials for lower-load sections.</w:t>
+        <w:t>-  Designed a transmitter mast with camera/sensor mounts; used stress analysis to reinforce high-load regions and select lighter materials elsewhere.</w:t>
       </w:r>
     </w:p>
     <w:p>
@@ -374,23 +341,15 @@
           <w:color w:val="202A31"/>
           <w:sz w:val="20"/>
         </w:rPr>
-        <w:t>BROADSWORD | Reusable Rocket Concept</w:t>
+        <w:t>BROADSWORD | Senior Design Rocket Concept</w:t>
       </w:r>
-    </w:p>
-    <w:p>
-      <w:pPr>
-        <w:keepNext/>
-        <w:keepLines/>
-        <w:spacing w:before="0" w:after="0" w:line="234" w:lineRule="exact"/>
-      </w:pPr>
       <w:r>
         <w:rPr>
           <w:rFonts w:ascii="Arial" w:hAnsi="Arial"/>
-          <w:b w:val="0"/>
           <w:color w:val="202A31"/>
           <w:sz w:val="20"/>
         </w:rPr>
-        <w:t>CAD &amp; Programming Subteam Lead | Sep–Dec 2023</w:t>
+        <w:t xml:space="preserve"> | Mechanical &amp; Programming Subgroup Lead | Aug-Dec 2023</w:t>
       </w:r>
     </w:p>
     <w:p>
@@ -407,7 +366,7 @@
           <w:color w:val="202A31"/>
           <w:sz w:val="20"/>
         </w:rPr>
-        <w:t>•  Created landing-leg CAD and code producing trajectory-angle-versus-time plots for a reusable rocket concept; delegated CAD/programming tasks, coordinated subteam work, and provided technical feedback.</w:t>
+        <w:t>-  Designed reusable rocket landing legs in Inventor and coded stage liftoff/landing trajectories; coordinated mechanical/programming tasks for a student concept project.</w:t>
       </w:r>
     </w:p>
     <w:p>
@@ -423,7 +382,7 @@
           <w:color w:val="202A31"/>
           <w:sz w:val="20"/>
         </w:rPr>
-        <w:t>NASA L’SPACE Mission Concept Academy</w:t>
+        <w:t>NASA L'SPACE Mission Concept Academy</w:t>
       </w:r>
     </w:p>
     <w:p>
@@ -439,7 +398,7 @@
           <w:color w:val="202A31"/>
           <w:sz w:val="20"/>
         </w:rPr>
-        <w:t>Mechanical Engineering Team Member — Educational Program | Fall 2026–Present</w:t>
+        <w:t>Mechanical Engineering Team Member - Educational Program | Fall 2026-Present</w:t>
       </w:r>
     </w:p>
     <w:p>
@@ -456,7 +415,7 @@
           <w:color w:val="202A31"/>
           <w:sz w:val="20"/>
         </w:rPr>
-        <w:t>•  Help plan science approaches and evaluate mechanical components for a robotic lunar surface payload mission concept.</w:t>
+        <w:t>-  Help plan science approaches and evaluate mechanical components for a robotic lunar payload mission concept.</w:t>
       </w:r>
     </w:p>
     <w:p>
@@ -474,21 +433,13 @@
         </w:rPr>
         <w:t>FIRST Robotics Team 3925</w:t>
       </w:r>
-    </w:p>
-    <w:p>
-      <w:pPr>
-        <w:keepNext/>
-        <w:keepLines/>
-        <w:spacing w:before="0" w:after="0" w:line="234" w:lineRule="exact"/>
-      </w:pPr>
       <w:r>
         <w:rPr>
           <w:rFonts w:ascii="Arial" w:hAnsi="Arial"/>
-          <w:b w:val="0"/>
           <w:color w:val="202A31"/>
           <w:sz w:val="20"/>
         </w:rPr>
-        <w:t>Electrical Lead — High School Robotics | 2020–2022</w:t>
+        <w:t xml:space="preserve"> | Electrical Lead - High School Robotics | 2020-2022</w:t>
       </w:r>
     </w:p>
     <w:p>
@@ -505,7 +456,7 @@
           <w:color w:val="202A31"/>
           <w:sz w:val="20"/>
         </w:rPr>
-        <w:t>•  Designed circuitry and tested batteries for the team's robot.</w:t>
+        <w:t>-  Led robot circuitry design, battery testing, and circuit repairs; developed programming knowledge alongside electrical work.</w:t>
       </w:r>
     </w:p>
     <w:p>
@@ -538,7 +489,7 @@
           <w:color w:val="202A31"/>
           <w:sz w:val="20"/>
         </w:rPr>
-        <w:t>•  AE 20 | Created high-level motor designs in introductory CAD coursework.</w:t>
+        <w:t>-  AE 20 / ENGR 10 | Modeled a V6 piston engine in Inventor with paper schematics; completed wind-tunnel blade/structural design, power-efficiency studies, and robot design/build/programming.</w:t>
       </w:r>
     </w:p>
     <w:p>
@@ -555,7 +506,7 @@
           <w:color w:val="202A31"/>
           <w:sz w:val="20"/>
         </w:rPr>
-        <w:t>•  AE 112 / AE 114 | Studied structural dynamics and physical/material properties.</w:t>
+        <w:t>-  AE 112 / AE 114 | Tested structural/building designs and compared calculations in labs; studied material properties.</w:t>
       </w:r>
     </w:p>
     <w:p>
@@ -572,7 +523,7 @@
           <w:color w:val="202A31"/>
           <w:sz w:val="20"/>
         </w:rPr>
-        <w:t>•  AE 160 / AE 162 | Used open wind-tunnel lab simulations to test wing airfoils and other objects.</w:t>
+        <w:t>-  AE 160 / AE 162 | Tested objects in an open wind tunnel; analyzed lift, drag, pitch, coefficients, and vortices; studied Navier-Stokes equations in aerodynamics coursework.</w:t>
       </w:r>
     </w:p>
     <w:p>
@@ -621,7 +572,7 @@
           <w:color w:val="202A31"/>
           <w:sz w:val="20"/>
         </w:rPr>
-        <w:t>•  Worked San Jose Earthquakes and Bay FC women's team matches.</w:t>
+        <w:t>-  Worked San Jose Earthquakes and Bay FC women's team matches.</w:t>
       </w:r>
     </w:p>
     <w:p>
@@ -637,7 +588,7 @@
           <w:color w:val="202A31"/>
           <w:sz w:val="20"/>
         </w:rPr>
-        <w:t>The Tech Interactive | Educator I | 2024–2025</w:t>
+        <w:t>The Tech Interactive | Educator I | 2024-2025</w:t>
       </w:r>
     </w:p>
     <w:p>
@@ -654,7 +605,7 @@
           <w:color w:val="202A31"/>
           <w:sz w:val="20"/>
         </w:rPr>
-        <w:t>•  Led STEM labs/design challenges and explained procedures and technical concepts.</w:t>
+        <w:t>-  Led STEM labs/design challenges and explained procedures and technical concepts.</w:t>
       </w:r>
     </w:p>
     <w:p>
@@ -687,7 +638,7 @@
           <w:color w:val="202A31"/>
           <w:sz w:val="20"/>
         </w:rPr>
-        <w:t>•  Scheduled clients and tailored swim lessons to individual needs.</w:t>
+        <w:t>-  Scheduled clients and tailored swim lessons to individual needs.</w:t>
       </w:r>
     </w:p>
     <w:p>
@@ -703,7 +654,7 @@
           <w:color w:val="202A31"/>
           <w:sz w:val="20"/>
         </w:rPr>
-        <w:t>YMCA &amp; Ventura Aquatics Center | Swim Instructor / Coach / Lifeguard | 2021–2024</w:t>
+        <w:t>YMCA &amp; Ventura Aquatics Center | Swim Instructor / Coach / Lifeguard | 2021-2024</w:t>
       </w:r>
     </w:p>
     <w:p>
@@ -720,7 +671,39 @@
           <w:color w:val="202A31"/>
           <w:sz w:val="20"/>
         </w:rPr>
-        <w:t>•  Balanced coaching/lifeguard work and adapted swim lessons to varied abilities.</w:t>
+        <w:t>-  Balanced coaching/lifeguard work and adapted swim lessons to varied abilities.</w:t>
+      </w:r>
+    </w:p>
+    <w:p>
+      <w:pPr>
+        <w:keepNext/>
+        <w:keepLines/>
+        <w:spacing w:before="100" w:after="60" w:line="240" w:lineRule="exact"/>
+      </w:pPr>
+      <w:r>
+        <w:rPr>
+          <w:rFonts w:ascii="Arial" w:hAnsi="Arial"/>
+          <w:b/>
+          <w:color w:val="133446"/>
+          <w:sz w:val="20"/>
+        </w:rPr>
+        <w:t>LEADERSHIP &amp; ATHLETICS</w:t>
+      </w:r>
+    </w:p>
+    <w:p>
+      <w:pPr>
+        <w:keepNext w:val="0"/>
+        <w:keepLines/>
+        <w:spacing w:before="0" w:after="0" w:line="234" w:lineRule="exact"/>
+      </w:pPr>
+      <w:r>
+        <w:rPr>
+          <w:rFonts w:ascii="Arial" w:hAnsi="Arial"/>
+          <w:b w:val="0"/>
+          <w:color w:val="202A31"/>
+          <w:sz w:val="20"/>
+        </w:rPr>
+        <w:t>SJSU Division I Club Ultimate | 2022-Present: coordinate gym training and conditioning. SJSU Club Swimming | Spring 2026: competed at a Cal-hosted meet.</w:t>
       </w:r>
     </w:p>
     <w:sectPr>

</xml_diff>